<commit_message>
Updated README and Improved data dictionary to meet requirements
</commit_message>
<xml_diff>
--- a/reports/07_report.docx
+++ b/reports/07_report.docx
@@ -110,17 +110,6 @@
           <w:rStyle w:val="NormalTok"/>
         </w:rPr>
         <w:t xml:space="preserve">(reshape2)</w:t>
-      </w:r>
-    </w:p>
-    <w:p>
-      <w:pPr>
-        <w:pStyle w:val="SourceCode"/>
-      </w:pPr>
-      <w:r>
-        <w:rPr>
-          <w:rStyle w:val="VerbatimChar"/>
-        </w:rPr>
-        <w:t xml:space="preserve">## Warning: package 'reshape2' was built under R version 4.3.3</w:t>
       </w:r>
     </w:p>
     <w:bookmarkStart w:id="20" w:name="dataset-overview"/>

</xml_diff>

<commit_message>
Refined presentation and final project updates
</commit_message>
<xml_diff>
--- a/reports/07_report.docx
+++ b/reports/07_report.docx
@@ -137,7 +137,7 @@
         <w:rPr>
           <w:rStyle w:val="VerbatimChar"/>
         </w:rPr>
-        <w:t xml:space="preserve">##   Patient.Name            Age         Gender      Condition     Medication </w:t>
+        <w:t xml:space="preserve">##   Patient.Name            Age         Gender      Condition     Medication     Visit.Date Blood.Pressure    Cholesterol </w:t>
       </w:r>
       <w:r>
         <w:br/>
@@ -146,7 +146,7 @@
         <w:rPr>
           <w:rStyle w:val="VerbatimChar"/>
         </w:rPr>
-        <w:t xml:space="preserve">##              0            159              0              0              0 </w:t>
+        <w:t xml:space="preserve">##              0            159              0              0              0              0            166            231 </w:t>
       </w:r>
       <w:r>
         <w:br/>
@@ -155,7 +155,7 @@
         <w:rPr>
           <w:rStyle w:val="VerbatimChar"/>
         </w:rPr>
-        <w:t xml:space="preserve">##     Visit.Date Blood.Pressure    Cholesterol          Email   Phone.Number </w:t>
+        <w:t xml:space="preserve">##          Email   Phone.Number </w:t>
       </w:r>
       <w:r>
         <w:br/>
@@ -164,7 +164,7 @@
         <w:rPr>
           <w:rStyle w:val="VerbatimChar"/>
         </w:rPr>
-        <w:t xml:space="preserve">##              0            166            231            384            179</w:t>
+        <w:t xml:space="preserve">##            384            179</w:t>
       </w:r>
     </w:p>
     <w:bookmarkEnd w:id="21"/>
@@ -729,7 +729,7 @@
         <w:rPr>
           <w:rStyle w:val="VerbatimChar"/>
         </w:rPr>
-        <w:t xml:space="preserve">##  Patient.Name            Age        Gender           Condition        </w:t>
+        <w:t xml:space="preserve">##  Patient.Name            Age        Gender           Condition          Medication          Visit.Date        </w:t>
       </w:r>
       <w:r>
         <w:br/>
@@ -738,7 +738,7 @@
         <w:rPr>
           <w:rStyle w:val="VerbatimChar"/>
         </w:rPr>
-        <w:t xml:space="preserve">##  Length:50          Min.   :25   Length:50          Length:50         </w:t>
+        <w:t xml:space="preserve">##  Length:50          Min.   :25   Length:50          Length:50          Length:50          Min.   :2018-04-05  </w:t>
       </w:r>
       <w:r>
         <w:br/>
@@ -747,7 +747,7 @@
         <w:rPr>
           <w:rStyle w:val="VerbatimChar"/>
         </w:rPr>
-        <w:t xml:space="preserve">##  Class :character   1st Qu.:35   Class :character   Class :character  </w:t>
+        <w:t xml:space="preserve">##  Class :character   1st Qu.:35   Class :character   Class :character   Class :character   1st Qu.:2019-03-25  </w:t>
       </w:r>
       <w:r>
         <w:br/>
@@ -756,7 +756,7 @@
         <w:rPr>
           <w:rStyle w:val="VerbatimChar"/>
         </w:rPr>
-        <w:t xml:space="preserve">##  Mode  :character   Median :40   Mode  :character   Mode  :character  </w:t>
+        <w:t xml:space="preserve">##  Mode  :character   Median :40   Mode  :character   Mode  :character   Mode  :character   Median :2019-12-01  </w:t>
       </w:r>
       <w:r>
         <w:br/>
@@ -765,7 +765,7 @@
         <w:rPr>
           <w:rStyle w:val="VerbatimChar"/>
         </w:rPr>
-        <w:t xml:space="preserve">##                     Mean   :44                                        </w:t>
+        <w:t xml:space="preserve">##                     Mean   :44                                                            Mean   :2019-07-08  </w:t>
       </w:r>
       <w:r>
         <w:br/>
@@ -774,7 +774,7 @@
         <w:rPr>
           <w:rStyle w:val="VerbatimChar"/>
         </w:rPr>
-        <w:t xml:space="preserve">##                     3rd Qu.:60                                        </w:t>
+        <w:t xml:space="preserve">##                     3rd Qu.:60                                                            3rd Qu.:2020-01-15  </w:t>
       </w:r>
       <w:r>
         <w:br/>
@@ -783,7 +783,7 @@
         <w:rPr>
           <w:rStyle w:val="VerbatimChar"/>
         </w:rPr>
-        <w:t xml:space="preserve">##                     Max.   :70                                        </w:t>
+        <w:t xml:space="preserve">##                     Max.   :70                                                            Max.   :2020-02-20  </w:t>
       </w:r>
       <w:r>
         <w:br/>
@@ -792,7 +792,7 @@
         <w:rPr>
           <w:rStyle w:val="VerbatimChar"/>
         </w:rPr>
-        <w:t xml:space="preserve">##                                                                       </w:t>
+        <w:t xml:space="preserve">##                                                                                                               </w:t>
       </w:r>
       <w:r>
         <w:br/>
@@ -801,7 +801,7 @@
         <w:rPr>
           <w:rStyle w:val="VerbatimChar"/>
         </w:rPr>
-        <w:t xml:space="preserve">##   Medication          Visit.Date         Blood.Pressure      Cholesterol   </w:t>
+        <w:t xml:space="preserve">##  Blood.Pressure      Cholesterol       Email           Phone.Number        Age_Original   Age_Imputed_Flag</w:t>
       </w:r>
       <w:r>
         <w:br/>
@@ -810,7 +810,7 @@
         <w:rPr>
           <w:rStyle w:val="VerbatimChar"/>
         </w:rPr>
-        <w:t xml:space="preserve">##  Length:50          Min.   :2018-04-05   Length:50          Min.   :160.0  </w:t>
+        <w:t xml:space="preserve">##  Length:50          Min.   :160.0   Length:50          Length:50          Min.   :25.00   Mode :logical   </w:t>
       </w:r>
       <w:r>
         <w:br/>
@@ -819,7 +819,7 @@
         <w:rPr>
           <w:rStyle w:val="VerbatimChar"/>
         </w:rPr>
-        <w:t xml:space="preserve">##  Class :character   1st Qu.:2019-03-25   Class :character   1st Qu.:180.0  </w:t>
+        <w:t xml:space="preserve">##  Class :character   1st Qu.:180.0   Class :character   Class :character   1st Qu.:35.00   FALSE:39        </w:t>
       </w:r>
       <w:r>
         <w:br/>
@@ -828,7 +828,7 @@
         <w:rPr>
           <w:rStyle w:val="VerbatimChar"/>
         </w:rPr>
-        <w:t xml:space="preserve">##  Mode  :character   Median :2019-12-01   Mode  :character   Median :200.0  </w:t>
+        <w:t xml:space="preserve">##  Mode  :character   Median :200.0   Mode  :character   Mode  :character   Median :40.00   TRUE :11        </w:t>
       </w:r>
       <w:r>
         <w:br/>
@@ -837,7 +837,7 @@
         <w:rPr>
           <w:rStyle w:val="VerbatimChar"/>
         </w:rPr>
-        <w:t xml:space="preserve">##                     Mean   :2019-07-08                      Mean   :195.2  </w:t>
+        <w:t xml:space="preserve">##                     Mean   :195.2                                         Mean   :45.13                   </w:t>
       </w:r>
       <w:r>
         <w:br/>
@@ -846,7 +846,7 @@
         <w:rPr>
           <w:rStyle w:val="VerbatimChar"/>
         </w:rPr>
-        <w:t xml:space="preserve">##                     3rd Qu.:2020-01-15                      3rd Qu.:220.0  </w:t>
+        <w:t xml:space="preserve">##                     3rd Qu.:220.0                                         3rd Qu.:60.00                   </w:t>
       </w:r>
       <w:r>
         <w:br/>
@@ -855,7 +855,7 @@
         <w:rPr>
           <w:rStyle w:val="VerbatimChar"/>
         </w:rPr>
-        <w:t xml:space="preserve">##                     Max.   :2020-02-20                      Max.   :220.0  </w:t>
+        <w:t xml:space="preserve">##                     Max.   :220.0                                         Max.   :70.00                   </w:t>
       </w:r>
       <w:r>
         <w:br/>
@@ -864,16 +864,28 @@
         <w:rPr>
           <w:rStyle w:val="VerbatimChar"/>
         </w:rPr>
-        <w:t xml:space="preserve">##                                                             NA's   :8      </w:t>
-      </w:r>
-      <w:r>
-        <w:br/>
-      </w:r>
+        <w:t xml:space="preserve">##                     NA's   :8                                             NA's   :11</w:t>
+      </w:r>
+    </w:p>
+    <w:bookmarkEnd w:id="25"/>
+    <w:bookmarkStart w:id="26" w:name="missingness-after-cleaning"/>
+    <w:p>
+      <w:pPr>
+        <w:pStyle w:val="Heading1"/>
+      </w:pPr>
+      <w:r>
+        <w:t xml:space="preserve">7. Missingness After Cleaning</w:t>
+      </w:r>
+    </w:p>
+    <w:p>
+      <w:pPr>
+        <w:pStyle w:val="SourceCode"/>
+      </w:pPr>
       <w:r>
         <w:rPr>
           <w:rStyle w:val="VerbatimChar"/>
         </w:rPr>
-        <w:t xml:space="preserve">##     Email           Phone.Number        Age_Original   Age_Imputed_Flag</w:t>
+        <w:t xml:space="preserve">##     Patient.Name              Age           Gender        Condition       Medication       Visit.Date   Blood.Pressure </w:t>
       </w:r>
       <w:r>
         <w:br/>
@@ -882,7 +894,7 @@
         <w:rPr>
           <w:rStyle w:val="VerbatimChar"/>
         </w:rPr>
-        <w:t xml:space="preserve">##  Length:50          Length:50          Min.   :25.00   Mode :logical   </w:t>
+        <w:t xml:space="preserve">##                0                0                0                0                0                0                7 </w:t>
       </w:r>
       <w:r>
         <w:br/>
@@ -891,7 +903,7 @@
         <w:rPr>
           <w:rStyle w:val="VerbatimChar"/>
         </w:rPr>
-        <w:t xml:space="preserve">##  Class :character   Class :character   1st Qu.:35.00   FALSE:39        </w:t>
+        <w:t xml:space="preserve">##      Cholesterol            Email     Phone.Number     Age_Original Age_Imputed_Flag </w:t>
       </w:r>
       <w:r>
         <w:br/>
@@ -900,109 +912,7 @@
         <w:rPr>
           <w:rStyle w:val="VerbatimChar"/>
         </w:rPr>
-        <w:t xml:space="preserve">##  Mode  :character   Mode  :character   Median :40.00   TRUE :11        </w:t>
-      </w:r>
-      <w:r>
-        <w:br/>
-      </w:r>
-      <w:r>
-        <w:rPr>
-          <w:rStyle w:val="VerbatimChar"/>
-        </w:rPr>
-        <w:t xml:space="preserve">##                                        Mean   :45.13                   </w:t>
-      </w:r>
-      <w:r>
-        <w:br/>
-      </w:r>
-      <w:r>
-        <w:rPr>
-          <w:rStyle w:val="VerbatimChar"/>
-        </w:rPr>
-        <w:t xml:space="preserve">##                                        3rd Qu.:60.00                   </w:t>
-      </w:r>
-      <w:r>
-        <w:br/>
-      </w:r>
-      <w:r>
-        <w:rPr>
-          <w:rStyle w:val="VerbatimChar"/>
-        </w:rPr>
-        <w:t xml:space="preserve">##                                        Max.   :70.00                   </w:t>
-      </w:r>
-      <w:r>
-        <w:br/>
-      </w:r>
-      <w:r>
-        <w:rPr>
-          <w:rStyle w:val="VerbatimChar"/>
-        </w:rPr>
-        <w:t xml:space="preserve">##                                        NA's   :11</w:t>
-      </w:r>
-    </w:p>
-    <w:bookmarkEnd w:id="25"/>
-    <w:bookmarkStart w:id="26" w:name="missingness-after-cleaning"/>
-    <w:p>
-      <w:pPr>
-        <w:pStyle w:val="Heading1"/>
-      </w:pPr>
-      <w:r>
-        <w:t xml:space="preserve">7. Missingness After Cleaning</w:t>
-      </w:r>
-    </w:p>
-    <w:p>
-      <w:pPr>
-        <w:pStyle w:val="SourceCode"/>
-      </w:pPr>
-      <w:r>
-        <w:rPr>
-          <w:rStyle w:val="VerbatimChar"/>
-        </w:rPr>
-        <w:t xml:space="preserve">##     Patient.Name              Age           Gender        Condition </w:t>
-      </w:r>
-      <w:r>
-        <w:br/>
-      </w:r>
-      <w:r>
-        <w:rPr>
-          <w:rStyle w:val="VerbatimChar"/>
-        </w:rPr>
-        <w:t xml:space="preserve">##                0                0                0                0 </w:t>
-      </w:r>
-      <w:r>
-        <w:br/>
-      </w:r>
-      <w:r>
-        <w:rPr>
-          <w:rStyle w:val="VerbatimChar"/>
-        </w:rPr>
-        <w:t xml:space="preserve">##       Medication       Visit.Date   Blood.Pressure      Cholesterol </w:t>
-      </w:r>
-      <w:r>
-        <w:br/>
-      </w:r>
-      <w:r>
-        <w:rPr>
-          <w:rStyle w:val="VerbatimChar"/>
-        </w:rPr>
-        <w:t xml:space="preserve">##                0                0                7                8 </w:t>
-      </w:r>
-      <w:r>
-        <w:br/>
-      </w:r>
-      <w:r>
-        <w:rPr>
-          <w:rStyle w:val="VerbatimChar"/>
-        </w:rPr>
-        <w:t xml:space="preserve">##            Email     Phone.Number     Age_Original Age_Imputed_Flag </w:t>
-      </w:r>
-      <w:r>
-        <w:br/>
-      </w:r>
-      <w:r>
-        <w:rPr>
-          <w:rStyle w:val="VerbatimChar"/>
-        </w:rPr>
-        <w:t xml:space="preserve">##               22               21               11                0</w:t>
+        <w:t xml:space="preserve">##                8               22               21               11                0</w:t>
       </w:r>
     </w:p>
     <w:bookmarkEnd w:id="26"/>

</xml_diff>